<commit_message>
Updated code to handle the experiences section from the resume and populate it in the main layout. Updated styling and subtle animations.
</commit_message>
<xml_diff>
--- a/CorporatePortfolio/wwwroot/DavidTurner_Resume.docx
+++ b/CorporatePortfolio/wwwroot/DavidTurner_Resume.docx
@@ -303,6 +303,7 @@
         </w:tabs>
         <w:ind w:left="426"/>
       </w:pPr>
+      <w:bookmarkStart w:id="4" w:name="Experience_1_Details"/>
       <w:r>
         <w:t>Engineered a modular, JSON-based workflow automation engine supporting parallel task execution, notifications, data sync, and conditional logic</w:t>
       </w:r>
@@ -430,6 +431,7 @@
       <w:r>
         <w:t>Delivered robust reverse-engineered solutions to update and stabilize poorly documented legacy applications inherited from former contractors.</w:t>
       </w:r>
+      <w:bookmarkEnd w:id="4"/>
     </w:p>
     <w:p>
       <w:pPr>
@@ -469,7 +471,7 @@
           <w:iCs/>
         </w:rPr>
       </w:pPr>
-      <w:bookmarkStart w:id="4" w:name="Experience_2"/>
+      <w:bookmarkStart w:id="5" w:name="Experience_2"/>
       <w:r>
         <w:rPr>
           <w:i/>
@@ -507,7 +509,7 @@
         </w:rPr>
         <w:t>Jan 2017 – Jan 2018</w:t>
       </w:r>
-      <w:bookmarkEnd w:id="4"/>
+      <w:bookmarkEnd w:id="5"/>
     </w:p>
     <w:p>
       <w:pPr>
@@ -518,6 +520,7 @@
         </w:tabs>
         <w:ind w:left="426"/>
       </w:pPr>
+      <w:bookmarkStart w:id="6" w:name="Experience_2_Details"/>
       <w:r>
         <w:t>Led development of automated notification systems integrated into core applications.</w:t>
       </w:r>
@@ -547,6 +550,7 @@
       <w:r>
         <w:t>Promoted to Tech Lead within 12 months due to performance and leadership.</w:t>
       </w:r>
+      <w:bookmarkEnd w:id="6"/>
     </w:p>
     <w:p>
       <w:pPr>
@@ -577,7 +581,7 @@
           <w:szCs w:val="28"/>
         </w:rPr>
       </w:pPr>
-      <w:bookmarkStart w:id="5" w:name="Experience_3"/>
+      <w:bookmarkStart w:id="7" w:name="Experience_3"/>
       <w:r>
         <w:rPr>
           <w:i/>
@@ -614,7 +618,7 @@
         </w:rPr>
         <w:t>Jan 2017</w:t>
       </w:r>
-      <w:bookmarkEnd w:id="5"/>
+      <w:bookmarkEnd w:id="7"/>
     </w:p>
     <w:p>
       <w:pPr>
@@ -625,6 +629,7 @@
         </w:tabs>
         <w:ind w:left="426"/>
       </w:pPr>
+      <w:bookmarkStart w:id="8" w:name="Experience_3_Details"/>
       <w:r>
         <w:t>Created incremental build and packaging systems in TFS 2013, significantly reducing build time and resource use.</w:t>
       </w:r>
@@ -677,6 +682,7 @@
       <w:r>
         <w:t>Authored numerous PowerShell scripts for deployment, monitoring, user impersonation, and automation.</w:t>
       </w:r>
+      <w:bookmarkEnd w:id="8"/>
     </w:p>
     <w:p>
       <w:r>
@@ -688,7 +694,7 @@
         <w:pStyle w:val="Heading3"/>
         <w:spacing w:before="480"/>
       </w:pPr>
-      <w:bookmarkStart w:id="6" w:name="Experience_4"/>
+      <w:bookmarkStart w:id="9" w:name="Experience_4"/>
       <w:r>
         <w:rPr>
           <w:i/>
@@ -720,7 +726,7 @@
         </w:rPr>
         <w:t>Sep 2011 – Mar 2015</w:t>
       </w:r>
-      <w:bookmarkEnd w:id="6"/>
+      <w:bookmarkEnd w:id="9"/>
     </w:p>
     <w:p>
       <w:pPr>
@@ -730,6 +736,7 @@
         </w:tabs>
         <w:ind w:left="426"/>
       </w:pPr>
+      <w:bookmarkStart w:id="10" w:name="Experience_4_Details"/>
       <w:r>
         <w:t>Built tools for SCCM delivery tracking, GPO management, and software deployment automation.</w:t>
       </w:r>
@@ -757,6 +764,7 @@
       <w:r>
         <w:t>Delivered remote workstation management utilities used bank-wide for IT support and deployment control.</w:t>
       </w:r>
+      <w:bookmarkEnd w:id="10"/>
     </w:p>
     <w:p>
       <w:pPr>
@@ -773,7 +781,7 @@
         <w:pStyle w:val="Heading3"/>
         <w:spacing w:before="480"/>
       </w:pPr>
-      <w:bookmarkStart w:id="7" w:name="Experience_5"/>
+      <w:bookmarkStart w:id="11" w:name="Experience_5"/>
       <w:r>
         <w:rPr>
           <w:i/>
@@ -804,7 +812,7 @@
         </w:rPr>
         <w:t>Mar 2009 – Sep 2011</w:t>
       </w:r>
-      <w:bookmarkEnd w:id="7"/>
+      <w:bookmarkEnd w:id="11"/>
     </w:p>
     <w:p>
       <w:pPr>
@@ -814,6 +822,7 @@
         </w:tabs>
         <w:ind w:left="426"/>
       </w:pPr>
+      <w:bookmarkStart w:id="12" w:name="Experience_5_Details"/>
       <w:r>
         <w:t>Designed a widely adopted all-in-one IT support tool integrating password resets, remote access, AD tools, and internal KBs.</w:t>
       </w:r>
@@ -857,6 +866,7 @@
       <w:r>
         <w:t>Authored data manipulation tools for call tracking and automation of repetitive IT tasks.</w:t>
       </w:r>
+      <w:bookmarkEnd w:id="12"/>
     </w:p>
     <w:p>
       <w:pPr>
@@ -873,7 +883,7 @@
         <w:pStyle w:val="Heading3"/>
         <w:spacing w:before="480"/>
       </w:pPr>
-      <w:bookmarkStart w:id="8" w:name="Experience_6"/>
+      <w:bookmarkStart w:id="13" w:name="Experience_6"/>
       <w:r>
         <w:rPr>
           <w:i/>
@@ -965,7 +975,7 @@
         </w:rPr>
         <w:t>08</w:t>
       </w:r>
-      <w:bookmarkEnd w:id="8"/>
+      <w:bookmarkEnd w:id="13"/>
     </w:p>
     <w:p>
       <w:pPr>
@@ -975,6 +985,7 @@
         </w:tabs>
         <w:ind w:left="426"/>
       </w:pPr>
+      <w:bookmarkStart w:id="14" w:name="Experience_6_Details"/>
       <w:r>
         <w:t>Developed Excel VBA tracking tools for RSA token management.</w:t>
       </w:r>
@@ -1002,6 +1013,7 @@
       <w:r>
         <w:t>Created and configured secure network shares and RSA account.</w:t>
       </w:r>
+      <w:bookmarkEnd w:id="14"/>
     </w:p>
     <w:p>
       <w:pPr>
@@ -1018,7 +1030,7 @@
         <w:spacing w:before="0"/>
         <w:ind w:left="227" w:hanging="227"/>
       </w:pPr>
-      <w:bookmarkStart w:id="9" w:name="Project_1"/>
+      <w:bookmarkStart w:id="15" w:name="Project_1"/>
       <w:r>
         <w:t>Generative AI Chatbot Integration | May 2026</w:t>
       </w:r>
@@ -1243,7 +1255,7 @@
         </w:rPr>
         <w:t>.</w:t>
       </w:r>
-      <w:bookmarkEnd w:id="9"/>
+      <w:bookmarkEnd w:id="15"/>
     </w:p>
     <w:p>
       <w:pPr>

</xml_diff>

<commit_message>
Updated to dynamically pull the skills from the resume, max 6.
</commit_message>
<xml_diff>
--- a/CorporatePortfolio/wwwroot/DavidTurner_Resume.docx
+++ b/CorporatePortfolio/wwwroot/DavidTurner_Resume.docx
@@ -111,7 +111,7 @@
         <w:t xml:space="preserve">: </w:t>
       </w:r>
       <w:r>
-        <w:t>App Services, Azure SQL, Azure DevOps (YAML Pipelines, CI/CD), AD, Generative AI (Azure AI Vision), Git, NuGet</w:t>
+        <w:t>App Services, Azure SQL, Azure DevOps (YAML Pipelines, CI/CD), AD, Git, NuGet</w:t>
       </w:r>
     </w:p>
     <w:p>
@@ -159,7 +159,13 @@
         <w:t xml:space="preserve">Practices &amp; UI: </w:t>
       </w:r>
       <w:r>
-        <w:t>Agile/Scrum, TDD, SDLC, Code Reviews, Design Patterns, Kendo UI, jQuery, Responsive UI</w:t>
+        <w:t>Agile/Scrum, TDD, SDLC, Code Reviews, Design Patterns,</w:t>
+      </w:r>
+      <w:r>
+        <w:t xml:space="preserve"> Automation,</w:t>
+      </w:r>
+      <w:r>
+        <w:t xml:space="preserve"> Kendo UI, jQuery, Responsive UI</w:t>
       </w:r>
       <w:r>
         <w:t>, Razor, Blazor, Angular 2.0, AngularJS, JavaScript, CSS</w:t>
@@ -237,6 +243,12 @@
           <w:lang w:val="es-ES"/>
         </w:rPr>
         <w:t>ma3.2 LLM, Model Training</w:t>
+      </w:r>
+      <w:r>
+        <w:rPr>
+          <w:lang w:val="es-ES"/>
+        </w:rPr>
+        <w:t>, Generative AI (Azure AI Vision)</w:t>
       </w:r>
       <w:bookmarkEnd w:id="2"/>
     </w:p>

</xml_diff>

<commit_message>
Updated resume, updated responsive CSS and layouts, added functionality to highlight the skills clicked at the top within the experience section and scroll to the first item containing the skill name.
</commit_message>
<xml_diff>
--- a/CorporatePortfolio/wwwroot/DavidTurner_Resume.docx
+++ b/CorporatePortfolio/wwwroot/DavidTurner_Resume.docx
@@ -336,7 +336,7 @@
         <w:ind w:left="426"/>
       </w:pPr>
       <w:r>
-        <w:t>Built ASP.NET Core enterprise-grade web apps from the ground up, integrating authentication, caching, and routing.</w:t>
+        <w:t>Engineered responsive UI enterprise-grade web apps from the ground up using ASP.NET Core MVC and Kendo UI, configuring full-stack authentication, caching, and routing.</w:t>
       </w:r>
     </w:p>
     <w:p>
@@ -1331,16 +1331,11 @@
         <w:t xml:space="preserve"> C.V.I. -</w:t>
       </w:r>
       <w:r>
-        <w:t xml:space="preserve"> Information </w:t>
-      </w:r>
-      <w:proofErr w:type="gramStart"/>
-      <w:r>
-        <w:t>Technology</w:t>
+        <w:t xml:space="preserve"> Information Technology</w:t>
       </w:r>
       <w:r>
         <w:t xml:space="preserve"> :</w:t>
       </w:r>
-      <w:proofErr w:type="gramEnd"/>
       <w:r>
         <w:t xml:space="preserve"> </w:t>
       </w:r>
@@ -2322,7 +2317,6 @@
   <w:style w:type="character" w:default="1" w:styleId="DefaultParagraphFont">
     <w:name w:val="Default Paragraph Font"/>
     <w:uiPriority w:val="1"/>
-    <w:semiHidden/>
     <w:unhideWhenUsed/>
   </w:style>
   <w:style w:type="table" w:default="1" w:styleId="TableNormal">

</xml_diff>

<commit_message>
Update resume with portfolio link.
</commit_message>
<xml_diff>
--- a/CorporatePortfolio/wwwroot/DavidTurner_Resume.docx
+++ b/CorporatePortfolio/wwwroot/DavidTurner_Resume.docx
@@ -43,6 +43,39 @@
         </w:r>
       </w:hyperlink>
       <w:bookmarkEnd w:id="0"/>
+      <w:r>
+        <w:t xml:space="preserve"> | </w:t>
+      </w:r>
+      <w:r>
+        <w:rPr>
+          <w:b/>
+          <w:bCs/>
+        </w:rPr>
+        <w:t>Portfolio:</w:t>
+      </w:r>
+      <w:r>
+        <w:t xml:space="preserve"> </w:t>
+      </w:r>
+      <w:hyperlink r:id="rId7" w:history="1">
+        <w:r>
+          <w:rPr>
+            <w:rStyle w:val="Hyperlink"/>
+          </w:rPr>
+          <w:t>View Cor</w:t>
+        </w:r>
+        <w:r>
+          <w:rPr>
+            <w:rStyle w:val="Hyperlink"/>
+          </w:rPr>
+          <w:t>p</w:t>
+        </w:r>
+        <w:r>
+          <w:rPr>
+            <w:rStyle w:val="Hyperlink"/>
+          </w:rPr>
+          <w:t>orate Portfolio</w:t>
+        </w:r>
+      </w:hyperlink>
     </w:p>
     <w:p/>
     <w:p>
@@ -1331,11 +1364,16 @@
         <w:t xml:space="preserve"> C.V.I. -</w:t>
       </w:r>
       <w:r>
-        <w:t xml:space="preserve"> Information Technology</w:t>
+        <w:t xml:space="preserve"> Information </w:t>
+      </w:r>
+      <w:proofErr w:type="gramStart"/>
+      <w:r>
+        <w:t>Technology</w:t>
       </w:r>
       <w:r>
         <w:t xml:space="preserve"> :</w:t>
       </w:r>
+      <w:proofErr w:type="gramEnd"/>
       <w:r>
         <w:t xml:space="preserve"> </w:t>
       </w:r>
@@ -2317,6 +2355,7 @@
   <w:style w:type="character" w:default="1" w:styleId="DefaultParagraphFont">
     <w:name w:val="Default Paragraph Font"/>
     <w:uiPriority w:val="1"/>
+    <w:semiHidden/>
     <w:unhideWhenUsed/>
   </w:style>
   <w:style w:type="table" w:default="1" w:styleId="TableNormal">
@@ -13114,6 +13153,18 @@
     <w:rPr>
       <w:color w:val="605E5C"/>
       <w:shd w:val="clear" w:color="auto" w:fill="E1DFDD"/>
+    </w:rPr>
+  </w:style>
+  <w:style w:type="character" w:styleId="FollowedHyperlink">
+    <w:name w:val="FollowedHyperlink"/>
+    <w:basedOn w:val="DefaultParagraphFont"/>
+    <w:uiPriority w:val="99"/>
+    <w:semiHidden/>
+    <w:unhideWhenUsed/>
+    <w:rsid w:val="00176BBC"/>
+    <w:rPr>
+      <w:color w:val="800080" w:themeColor="followedHyperlink"/>
+      <w:u w:val="single"/>
     </w:rPr>
   </w:style>
 </w:styles>

</xml_diff>

<commit_message>
Update resume with project link
</commit_message>
<xml_diff>
--- a/CorporatePortfolio/wwwroot/DavidTurner_Resume.docx
+++ b/CorporatePortfolio/wwwroot/DavidTurner_Resume.docx
@@ -61,21 +61,12 @@
           <w:rPr>
             <w:rStyle w:val="Hyperlink"/>
           </w:rPr>
-          <w:t>View Cor</w:t>
-        </w:r>
-        <w:r>
-          <w:rPr>
-            <w:rStyle w:val="Hyperlink"/>
-          </w:rPr>
-          <w:t>p</w:t>
-        </w:r>
-        <w:r>
-          <w:rPr>
-            <w:rStyle w:val="Hyperlink"/>
-          </w:rPr>
-          <w:t>orate Portfolio</w:t>
+          <w:t>View Corporate Portfolio</w:t>
         </w:r>
       </w:hyperlink>
+      <w:r>
+        <w:t xml:space="preserve"> </w:t>
+      </w:r>
     </w:p>
     <w:p/>
     <w:p>
@@ -120,13 +111,8 @@
         <w:t xml:space="preserve">, SQL, </w:t>
       </w:r>
       <w:r>
-        <w:t xml:space="preserve">TypeScript, ASP.NET Core, MVC, Entity Framework, Angular, </w:t>
+        <w:t>TypeScript, ASP.NET Core, MVC, Entity Framework, Angular, SignalR</w:t>
       </w:r>
-      <w:proofErr w:type="spellStart"/>
-      <w:r>
-        <w:t>SignalR</w:t>
-      </w:r>
-      <w:proofErr w:type="spellEnd"/>
     </w:p>
     <w:p>
       <w:pPr>
@@ -160,23 +146,7 @@
         <w:t xml:space="preserve">Enterprise &amp; Tools: </w:t>
       </w:r>
       <w:r>
-        <w:t xml:space="preserve">SmartSimple CRM, CRM Dynamics, Active Directory, ADFS, SCCM, Visual Studio, Selenium, </w:t>
-      </w:r>
-      <w:proofErr w:type="spellStart"/>
-      <w:r>
-        <w:t>xUnit</w:t>
-      </w:r>
-      <w:proofErr w:type="spellEnd"/>
-      <w:r>
-        <w:t>/</w:t>
-      </w:r>
-      <w:proofErr w:type="spellStart"/>
-      <w:r>
-        <w:t>nUnit</w:t>
-      </w:r>
-      <w:proofErr w:type="spellEnd"/>
-      <w:r>
-        <w:t>, MS Test</w:t>
+        <w:t>SmartSimple CRM, CRM Dynamics, Active Directory, ADFS, SCCM, Visual Studio, Selenium, xUnit/nUnit, MS Test</w:t>
       </w:r>
     </w:p>
     <w:p>
@@ -214,15 +184,7 @@
         <w:ind w:left="426"/>
       </w:pPr>
       <w:r>
-        <w:t xml:space="preserve">Operating Systems: Windows (All Versions), Linux (Ubuntu, Fedora, </w:t>
-      </w:r>
-      <w:proofErr w:type="spellStart"/>
-      <w:r>
-        <w:t>Redhat</w:t>
-      </w:r>
-      <w:proofErr w:type="spellEnd"/>
-      <w:r>
-        <w:t>, Kali)</w:t>
+        <w:t>Operating Systems: Windows (All Versions), Linux (Ubuntu, Fedora, Redhat, Kali)</w:t>
       </w:r>
     </w:p>
     <w:p>
@@ -241,35 +203,7 @@
         <w:rPr>
           <w:lang w:val="es-ES"/>
         </w:rPr>
-        <w:t xml:space="preserve">AI </w:t>
-      </w:r>
-      <w:proofErr w:type="spellStart"/>
-      <w:r>
-        <w:rPr>
-          <w:lang w:val="es-ES"/>
-        </w:rPr>
-        <w:t>Components</w:t>
-      </w:r>
-      <w:proofErr w:type="spellEnd"/>
-      <w:r>
-        <w:rPr>
-          <w:lang w:val="es-ES"/>
-        </w:rPr>
-        <w:t xml:space="preserve">: Ollama, </w:t>
-      </w:r>
-      <w:proofErr w:type="spellStart"/>
-      <w:r>
-        <w:rPr>
-          <w:lang w:val="es-ES"/>
-        </w:rPr>
-        <w:t>Groq</w:t>
-      </w:r>
-      <w:proofErr w:type="spellEnd"/>
-      <w:r>
-        <w:rPr>
-          <w:lang w:val="es-ES"/>
-        </w:rPr>
-        <w:t>, Lla</w:t>
+        <w:t>AI Components: Ollama, Groq, Lla</w:t>
       </w:r>
       <w:r>
         <w:rPr>
@@ -883,19 +817,9 @@
       <w:r>
         <w:t xml:space="preserve">Reverse engineered </w:t>
       </w:r>
-      <w:proofErr w:type="spellStart"/>
       <w:r>
-        <w:t>PsTools</w:t>
+        <w:t>PsTools by Sysinternals</w:t>
       </w:r>
-      <w:proofErr w:type="spellEnd"/>
-      <w:r>
-        <w:t xml:space="preserve"> by </w:t>
-      </w:r>
-      <w:proofErr w:type="spellStart"/>
-      <w:r>
-        <w:t>Sysinternals</w:t>
-      </w:r>
-      <w:proofErr w:type="spellEnd"/>
       <w:r>
         <w:t xml:space="preserve"> to create graphical remote process managers for help desk efficiency.</w:t>
       </w:r>
@@ -1155,7 +1079,6 @@
         </w:rPr>
         <w:t xml:space="preserve">Engineered a modular provider system to toggle between a local </w:t>
       </w:r>
-      <w:proofErr w:type="spellStart"/>
       <w:r>
         <w:rPr>
           <w:b/>
@@ -1164,30 +1087,19 @@
         </w:rPr>
         <w:t>Ollama</w:t>
       </w:r>
-      <w:proofErr w:type="spellEnd"/>
       <w:r>
         <w:rPr>
           <w:lang w:val="en-CA"/>
         </w:rPr>
         <w:t xml:space="preserve"> instance (Llama 3.2) for private development and </w:t>
       </w:r>
-      <w:proofErr w:type="spellStart"/>
       <w:r>
         <w:rPr>
           <w:b/>
           <w:bCs/>
           <w:lang w:val="en-CA"/>
         </w:rPr>
-        <w:t>Groq’s</w:t>
-      </w:r>
-      <w:proofErr w:type="spellEnd"/>
-      <w:r>
-        <w:rPr>
-          <w:b/>
-          <w:bCs/>
-          <w:lang w:val="en-CA"/>
-        </w:rPr>
-        <w:t xml:space="preserve"> LPU</w:t>
+        <w:t>Groq’s LPU</w:t>
       </w:r>
       <w:r>
         <w:rPr>
@@ -1213,7 +1125,6 @@
         </w:rPr>
         <w:t>Implemented real-time streaming responses in C# Razor components using asynchronous iterators (</w:t>
       </w:r>
-      <w:proofErr w:type="spellStart"/>
       <w:r>
         <w:rPr>
           <w:b/>
@@ -1222,7 +1133,6 @@
         </w:rPr>
         <w:t>IAsyncEnumerable</w:t>
       </w:r>
-      <w:proofErr w:type="spellEnd"/>
       <w:r>
         <w:rPr>
           <w:lang w:val="en-CA"/>
@@ -1335,13 +1245,8 @@
         </w:tabs>
         <w:ind w:left="426"/>
       </w:pPr>
-      <w:proofErr w:type="spellStart"/>
       <w:r>
-        <w:t>ProTech</w:t>
-      </w:r>
-      <w:proofErr w:type="spellEnd"/>
-      <w:r>
-        <w:t xml:space="preserve"> Training Services - </w:t>
+        <w:t xml:space="preserve">ProTech Training Services - </w:t>
       </w:r>
       <w:r>
         <w:t>ALM &amp; Microsoft TFS</w:t>
@@ -1355,25 +1260,15 @@
         </w:tabs>
         <w:ind w:left="426"/>
       </w:pPr>
-      <w:proofErr w:type="spellStart"/>
       <w:r>
-        <w:t>Eastdale</w:t>
-      </w:r>
-      <w:proofErr w:type="spellEnd"/>
-      <w:r>
-        <w:t xml:space="preserve"> C.V.I. -</w:t>
+        <w:t>Eastdale C.V.I. -</w:t>
       </w:r>
       <w:r>
-        <w:t xml:space="preserve"> Information </w:t>
-      </w:r>
-      <w:proofErr w:type="gramStart"/>
-      <w:r>
-        <w:t>Technology</w:t>
+        <w:t xml:space="preserve"> Information Technology</w:t>
       </w:r>
       <w:r>
         <w:t xml:space="preserve"> :</w:t>
       </w:r>
-      <w:proofErr w:type="gramEnd"/>
       <w:r>
         <w:t xml:space="preserve"> </w:t>
       </w:r>

</xml_diff>